<commit_message>
Acknowledge Dirk Roorda in article
</commit_message>
<xml_diff>
--- a/docs/introducing-cf-v2/hiphil-novum/intro-to-cf__hiphil-novum.docx
+++ b/docs/introducing-cf-v2/hiphil-novum/intro-to-cf__hiphil-novum.docx
@@ -14340,6 +14340,15 @@
       </w:pPr>
       <w:r>
         <w:t xml:space="preserve">Acknowledgements</w:t>
+      </w:r>
+    </w:p>
+    <w:p>
+      <w:pPr>
+        <w:pStyle w:val="HIPHILbody"/>
+        <w:spacing w:after="140"/>
+      </w:pPr>
+      <w:r>
+        <w:t xml:space="preserve">I would like to acknowledge the scholarship, influence, and friendship of Dirk Roorda, whose creativity and rebelliousness have always inspired me. May his contributions continue to bear fruit into the distant future.</w:t>
       </w:r>
     </w:p>
     <w:p>

</xml_diff>

<commit_message>
Acknowledge Dirk Roorda in article (#5)
Add a dedicated acknowledgement honoring Dirk Roorda and regenerate the HIPHIL Novum submission documents.
</commit_message>
<xml_diff>
--- a/docs/introducing-cf-v2/hiphil-novum/intro-to-cf__hiphil-novum.docx
+++ b/docs/introducing-cf-v2/hiphil-novum/intro-to-cf__hiphil-novum.docx
@@ -14340,6 +14340,15 @@
       </w:pPr>
       <w:r>
         <w:t xml:space="preserve">Acknowledgements</w:t>
+      </w:r>
+    </w:p>
+    <w:p>
+      <w:pPr>
+        <w:pStyle w:val="HIPHILbody"/>
+        <w:spacing w:after="140"/>
+      </w:pPr>
+      <w:r>
+        <w:t xml:space="preserve">I would like to acknowledge the scholarship, influence, and friendship of Dirk Roorda, whose creativity and rebelliousness have always inspired me. May his contributions continue to bear fruit into the distant future.</w:t>
       </w:r>
     </w:p>
     <w:p>

</xml_diff>

<commit_message>
Refine article AI acknowledgement
</commit_message>
<xml_diff>
--- a/docs/introducing-cf-v2/hiphil-novum/intro-to-cf__hiphil-novum.docx
+++ b/docs/introducing-cf-v2/hiphil-novum/intro-to-cf__hiphil-novum.docx
@@ -14345,6 +14345,8 @@
     <w:p>
       <w:pPr>
         <w:pStyle w:val="HIPHILbody"/>
+        <w:keepNext/>
+        <w:keepLines/>
         <w:spacing w:after="140"/>
       </w:pPr>
       <w:r>
@@ -14354,10 +14356,11 @@
     <w:p>
       <w:pPr>
         <w:pStyle w:val="HIPHILbody"/>
+        <w:keepLines/>
         <w:spacing w:after="140"/>
       </w:pPr>
       <w:r>
-        <w:t xml:space="preserve">During the preparation of this manuscript, the author used Anthropic Claude Opus 4.5 for the analysis code, and OpenAI Codex (GPT-5.6 Sol) for reference verification, preparation of visual elements, and document formatting. The re-write of TF -&gt; CF was done entirely by Opus 4.5. The entirety of the body text was hand-written by the author, but based loosely on a draft text generated by Claude. The author reviewed and edited the output and takes full responsibility for the content of this publication.</w:t>
+        <w:t xml:space="preserve">During the preparation of this manuscript, the author used Anthropic Claude Opus 4.5 for the analysis code, and OpenAI Codex (GPT-5.6 Sol) for reference verification, preparation of visual elements, and document formatting. The re-write of TF → CF was done by Opus 4.5, based on my prompting and specifications. The entirety of the body text was hand-written by the author, but based loosely on a draft text generated by Claude. The author reviewed and edited the output and takes full responsibility for the content of this publication.</w:t>
       </w:r>
     </w:p>
     <w:bookmarkEnd w:id="81"/>

</xml_diff>

<commit_message>
Refine article AI acknowledgement (#6)
Clarify the TF-to-CF rewrite attribution, use a Unicode arrow, and keep the acknowledgement section together in the rendered submission.
</commit_message>
<xml_diff>
--- a/docs/introducing-cf-v2/hiphil-novum/intro-to-cf__hiphil-novum.docx
+++ b/docs/introducing-cf-v2/hiphil-novum/intro-to-cf__hiphil-novum.docx
@@ -14345,6 +14345,8 @@
     <w:p>
       <w:pPr>
         <w:pStyle w:val="HIPHILbody"/>
+        <w:keepNext/>
+        <w:keepLines/>
         <w:spacing w:after="140"/>
       </w:pPr>
       <w:r>
@@ -14354,10 +14356,11 @@
     <w:p>
       <w:pPr>
         <w:pStyle w:val="HIPHILbody"/>
+        <w:keepLines/>
         <w:spacing w:after="140"/>
       </w:pPr>
       <w:r>
-        <w:t xml:space="preserve">During the preparation of this manuscript, the author used Anthropic Claude Opus 4.5 for the analysis code, and OpenAI Codex (GPT-5.6 Sol) for reference verification, preparation of visual elements, and document formatting. The re-write of TF -&gt; CF was done entirely by Opus 4.5. The entirety of the body text was hand-written by the author, but based loosely on a draft text generated by Claude. The author reviewed and edited the output and takes full responsibility for the content of this publication.</w:t>
+        <w:t xml:space="preserve">During the preparation of this manuscript, the author used Anthropic Claude Opus 4.5 for the analysis code, and OpenAI Codex (GPT-5.6 Sol) for reference verification, preparation of visual elements, and document formatting. The re-write of TF → CF was done by Opus 4.5, based on my prompting and specifications. The entirety of the body text was hand-written by the author, but based loosely on a draft text generated by Claude. The author reviewed and edited the output and takes full responsibility for the content of this publication.</w:t>
       </w:r>
     </w:p>
     <w:bookmarkEnd w:id="81"/>

</xml_diff>